<commit_message>
chore: TCC — tickets explicativos (PT/EN), apresentação mais visual e sem custo, guia do merge de etapa
</commit_message>
<xml_diff>
--- a/apresentacao-orientador/relatorios-por-etapa/E2-fundacao.docx
+++ b/apresentacao-orientador/relatorios-por-etapa/E2-fundacao.docx
@@ -766,34 +766,6 @@
           </w:p>
         </w:tc>
       </w:tr>
-      <w:tr>
-        <w:tc>
-          <w:tcPr>
-            <w:tcW w:type="dxa" w:w="5669"/>
-          </w:tcPr>
-          <w:p>
-            <w:r>
-              <w:rPr>
-                <w:sz w:val="19"/>
-              </w:rPr>
-              <w:t>Custo medido dos agentes (dólar-equivalente da cota)</w:t>
-            </w:r>
-          </w:p>
-        </w:tc>
-        <w:tc>
-          <w:tcPr>
-            <w:tcW w:type="dxa" w:w="3685"/>
-          </w:tcPr>
-          <w:p>
-            <w:r>
-              <w:rPr>
-                <w:sz w:val="19"/>
-              </w:rPr>
-              <w:t>US$ 11,81</w:t>
-            </w:r>
-          </w:p>
-        </w:tc>
-      </w:tr>
     </w:tbl>
     <w:p/>
     <w:p>

</xml_diff>